<commit_message>
Docs: replace bearlyused examples with generic user/pos.example.com
Installation Guide: replaced 3 client-specific references with
generic examples for distribution:
  ssh bearlyused@pos.bearlyused.net -> ssh user@pos.example.com
  /home/bearlyused/domains/pos.bearlyused.net -> /home/user/domains/pos.example.com
  https://pos.bearlyused.net -> https://pos.example.com

Developer Guide: already clean (0 references to client domain).
deploy/README.md: unchanged (production config for actual deployment).
</commit_message>
<xml_diff>
--- a/docs/TireShopPOS_Installation_Guide.docx
+++ b/docs/TireShopPOS_Installation_Guide.docx
@@ -1126,7 +1126,7 @@
           <w:sz w:val="18"/>
           <w:szCs w:val="18"/>
         </w:rPr>
-        <w:t xml:space="preserve">ssh bearlyused@pos.bearlyused.net</w:t>
+        <w:t xml:space="preserve">ssh user@pos.example.com</w:t>
       </w:r>
     </w:p>
     <w:p>
@@ -1180,7 +1180,7 @@
           <w:sz w:val="18"/>
           <w:szCs w:val="18"/>
         </w:rPr>
-        <w:t xml:space="preserve">cd /home/bearlyused/domains/pos.bearlyused.net</w:t>
+        <w:t xml:space="preserve">cd /home/user/domains/pos.example.com</w:t>
       </w:r>
     </w:p>
     <w:p>
@@ -2242,7 +2242,7 @@
           <w:sz w:val="22"/>
           <w:szCs w:val="22"/>
         </w:rPr>
-        <w:t xml:space="preserve">Open your browser and go to your URL (for example, https://pos.bearlyused.net). You should see the login screen. The default admin account is:</w:t>
+        <w:t xml:space="preserve">Open your browser and go to your URL (for example, https://pos.example.com). You should see the login screen. The default admin account is:</w:t>
       </w:r>
     </w:p>
     <w:p>

</xml_diff>